<commit_message>
Pack 50.1-F: template fix (city/date) + doc filter for naim
</commit_message>
<xml_diff>
--- a/templates/docx/contracts/naim/by_company/factor_stroy/employment_contract_template.docx
+++ b/templates/docx/contracts/naim/by_company/factor_stroy/employment_contract_template.docx
@@ -57,7 +57,7 @@
           <w:sz w:val="22"/>
           <w:szCs w:val="22"/>
         </w:rPr>
-        <w:t>{{ contract.sign_city }}                                                                                                       "{{ fmt_date_long_ru(contract.sign_date) }}" г.</w:t>
+        <w:t>г. {{ contract.sign_city }}                                                                                                       {{ fmt_date_long_ru(contract.sign_date) }}</w:t>
       </w:r>
     </w:p>
     <w:p>
@@ -421,7 +421,7 @@
           <w:sz w:val="22"/>
           <w:szCs w:val="22"/>
         </w:rPr>
-        <w:t>2.1. Работник обязуется приступить к выполнению своих трудовых обязанностей   с "{{ fmt_date_long_ru(contract.sign_date) }}" г.</w:t>
+        <w:t>2.1. Работник обязуется приступить к выполнению своих трудовых обязанностей   с {{ fmt_date_long_ru(contract.sign_date) }}</w:t>
       </w:r>
     </w:p>
     <w:p>
@@ -2470,7 +2470,7 @@
                 <w:rFonts w:ascii="Microsoft Sans Serif" w:hAnsi="Microsoft Sans Serif" w:cs="Microsoft Sans Serif"/>
                 <w:spacing w:val="-2"/>
               </w:rPr>
-              <w:t>ИНН {{ applicant.inn }}, СНИЛС</w:t>
+              <w:t>ИНН {{ applicant.inn }}, СНИЛС {{ applicant.snils }}</w:t>
             </w:r>
           </w:p>
           <w:p>

</xml_diff>